<commit_message>
Update CODEXA platform: enhance analysis suite, frontend UI, viva guide, and project report documentation
</commit_message>
<xml_diff>
--- a/CODEXA_Synopsis (1).docx
+++ b/CODEXA_Synopsis (1).docx
@@ -580,53 +580,6 @@
         </w:rPr>
         <w:t>)</w:t>
       </w:r>
-    </w:p>
-    <w:p>
-      <w:pPr>
-        <w:pStyle w:val="Heading1"/>
-        <w:ind w:left="3090" w:right="3107"/>
-      </w:pPr>
-      <w:r>
-        <w:lastRenderedPageBreak/>
-        <w:t>Index</w:t>
-      </w:r>
-    </w:p>
-    <w:p>
-      <w:pPr>
-        <w:pBdr>
-          <w:top w:val="nil"/>
-          <w:left w:val="nil"/>
-          <w:bottom w:val="nil"/>
-          <w:right w:val="nil"/>
-          <w:between w:val="nil"/>
-        </w:pBdr>
-        <w:rPr>
-          <w:b/>
-          <w:bCs/>
-          <w:color w:val="000000"/>
-          <w:sz w:val="48"/>
-          <w:szCs w:val="48"/>
-        </w:rPr>
-      </w:pPr>
-    </w:p>
-    <w:p>
-      <w:pPr>
-        <w:pBdr>
-          <w:top w:val="nil"/>
-          <w:left w:val="nil"/>
-          <w:bottom w:val="nil"/>
-          <w:right w:val="nil"/>
-          <w:between w:val="nil"/>
-        </w:pBdr>
-        <w:spacing w:before="8"/>
-        <w:rPr>
-          <w:b/>
-          <w:bCs/>
-          <w:color w:val="000000"/>
-          <w:sz w:val="37"/>
-          <w:szCs w:val="37"/>
-        </w:rPr>
-      </w:pPr>
     </w:p>
     <w:p>
       <w:pPr>

</xml_diff>